<commit_message>
Kosten-Nutzen-PDF auf 12 Wohnungen, Restaurant und Bar, getrennte Gastro und Eigenkapital-Variante aktualisiert
Co-Authored-By: Claude Sonnet 5.5 <noreply@anthropic.com>
Claude-Session: https://claude.ai/code/session_01HJGZfxHv7bzYyqdLwg8aFJ
</commit_message>
<xml_diff>
--- a/praesentation/Kosten-Nutzen_pro-Kopf_Baufeld3.docx
+++ b/praesentation/Kosten-Nutzen_pro-Kopf_Baufeld3.docx
@@ -42,7 +42,7 @@
           <w:color w:val="5A5F66"/>
           <w:sz w:val="19"/>
         </w:rPr>
-        <w:t>Kurze Erklärung für die Gesellschafter einer GbR. Basis: Excel-Rechenmodell (8 Wohnungen, 2 Büros, Gastro 510 m²), Jahr 1 nach der Anlaufzeit. Alle Zahlen sind Planungsannahmen, Stand Oktober 2026.</w:t>
+        <w:t>Kurze Erklärung für die Gesellschafter einer Vermietungs-GbR. Basis: Excel-Rechenmodell (12 Wohnungen, 2 Büros, Restaurant und Bar 510 m² als getrennte Betreiberfirma), Jahr 1 nach der Anlaufzeit, ohne Eigenkapital. Alle Zahlen sind Planungsannahmen, Stand Oktober 2026.</w:t>
       </w:r>
     </w:p>
     <w:p>
@@ -70,7 +70,7 @@
           <w:b w:val="0"/>
           <w:i w:val="0"/>
         </w:rPr>
-        <w:t>Die Gesamtkosten liegen bei 4.845.506 € (Grundstück 236.256 €, Bau, Nebenkosten, Gastro- und Büro-Ausbau, Finanzierungskosten in der Bauzeit). Sie werden zu 100 % über KfW-Kredite und Hausbank finanziert, die Gesellschafter zahlen kein Eigenkapital ein. Die Rate für Zins und 1 % Tilgung beträgt 17.733 € im Monat (212.800 € im Jahr).</w:t>
+        <w:t>Die Gesamtkosten liegen bei 4.894.879 € (Grundstück, Bau, Nebenkosten, Ausbau, Mehrkosten für 4 zusätzliche Wohnungen, Finanzierungskosten der Bauzeit). Finanziert wird mit KfW-Krediten (2.947.500 €, 60 %) und Hausbank, die Gesellschafter zahlen im Basisfall kein Eigenkapital. Die KfW-Förderung spart 38.475 € Zinsen im Jahr gegenüber reiner Hausbank-Finanzierung. Zins und 1 % Tilgung betragen 17.189 € im Monat (206.269 € im Jahr).</w:t>
       </w:r>
     </w:p>
     <w:p>
@@ -86,7 +86,7 @@
           <w:color w:val="8B3A2F"/>
           <w:sz w:val="28"/>
         </w:rPr>
-        <w:t>2 Was kommt rein? (pro Jahr)</w:t>
+        <w:t>2 Was kommt rein? (Vermietungs-GbR, pro Jahr)</w:t>
       </w:r>
     </w:p>
     <w:tbl>
@@ -158,7 +158,7 @@
               <w:rPr>
                 <w:sz w:val="19"/>
               </w:rPr>
-              <w:t>Mieten Wohnen (8 Wohnungen, 655 m²) + Büros (2 Ankermieter) + Gastro-Pacht</w:t>
+              <w:t>Mieten Wohnen (12 Wohnungen, 655 m²) + Büros (2 Ankermieter) + Gastro-Pacht (10 % vom Umsatz)</w:t>
             </w:r>
           </w:p>
         </w:tc>
@@ -176,7 +176,7 @@
               <w:rPr>
                 <w:sz w:val="19"/>
               </w:rPr>
-              <w:t>168.247 €</w:t>
+              <w:t>221.809 €</w:t>
             </w:r>
           </w:p>
         </w:tc>
@@ -213,44 +213,7 @@
               <w:rPr>
                 <w:sz w:val="19"/>
               </w:rPr>
-              <w:t>−16.825 €</w:t>
-            </w:r>
-          </w:p>
-        </w:tc>
-      </w:tr>
-      <w:tr>
-        <w:tc>
-          <w:tcPr>
-            <w:tcW w:type="dxa" w:w="7483"/>
-          </w:tcPr>
-          <w:p>
-            <w:pPr>
-              <w:spacing w:after="20"/>
-            </w:pPr>
-            <w:r/>
-            <w:r>
-              <w:rPr>
-                <w:sz w:val="19"/>
-              </w:rPr>
-              <w:t>Gastro-Betriebsergebnis nach Pacht (Umsatz 65.010 € im Monat, ohne Lohn)</w:t>
-            </w:r>
-          </w:p>
-        </w:tc>
-        <w:tc>
-          <w:tcPr>
-            <w:tcW w:type="dxa" w:w="2154"/>
-          </w:tcPr>
-          <w:p>
-            <w:pPr>
-              <w:spacing w:after="20"/>
-              <w:jc w:val="right"/>
-            </w:pPr>
-            <w:r/>
-            <w:r>
-              <w:rPr>
-                <w:sz w:val="19"/>
-              </w:rPr>
-              <w:t>176.737 €</w:t>
+              <w:t>−22.181 €</w:t>
             </w:r>
           </w:p>
         </w:tc>
@@ -271,7 +234,7 @@
                 <w:b/>
                 <w:sz w:val="19"/>
               </w:rPr>
-              <w:t>Ertrag vor Kapitaldienst</w:t>
+              <w:t>Nettoertrag der GbR</w:t>
             </w:r>
           </w:p>
         </w:tc>
@@ -291,7 +254,7 @@
                 <w:b/>
                 <w:sz w:val="19"/>
               </w:rPr>
-              <w:t>328.159 €</w:t>
+              <w:t>199.628 €</w:t>
             </w:r>
           </w:p>
         </w:tc>
@@ -328,7 +291,7 @@
               <w:rPr>
                 <w:sz w:val="19"/>
               </w:rPr>
-              <w:t>−212.800 €</w:t>
+              <w:t>−206.269 €</w:t>
             </w:r>
           </w:p>
         </w:tc>
@@ -349,7 +312,7 @@
                 <w:b/>
                 <w:sz w:val="19"/>
               </w:rPr>
-              <w:t>Cash für die Gesellschafter</w:t>
+              <w:t>Cash der GbR für die Gesellschafter</w:t>
             </w:r>
           </w:p>
         </w:tc>
@@ -369,7 +332,7 @@
                 <w:b/>
                 <w:sz w:val="19"/>
               </w:rPr>
-              <w:t>115.359 €</w:t>
+              <w:t>−6.641 €</w:t>
             </w:r>
           </w:p>
         </w:tc>
@@ -389,7 +352,7 @@
           <w:b w:val="0"/>
           <w:i w:val="0"/>
         </w:rPr>
-        <w:t>Nutzen-Faktor: Der Ertrag vor Kapitaldienst entspricht 6,8 % der Gesamtkosten (Anfangsrendite), die Kosten sind also das 14,8-Fache des Jahresertrags. Nur aus Mieten und Pacht wären es 3,1 %, das reicht nicht für die Raten.</w:t>
+        <w:t>Nutzen-Faktor: Der Nettoertrag entspricht 4,1 % der Gesamtkosten (Anfangsrendite), die Kosten sind das 24,5-Fache des Jahresertrags. Die Kapitaldienstdeckung der GbR beträgt 0,97, Banken verlangen meist 1,2. Das Gastro-Betriebsergebnis (235.262 € im Jahr nach Pacht) gehört der Betreiberfirma des Bauherrn und ist nicht enthalten.</w:t>
       </w:r>
     </w:p>
     <w:p>
@@ -417,17 +380,17 @@
         <w:tblLayout w:type="fixed"/>
       </w:tblPr>
       <w:tblGrid>
-        <w:gridCol w:w="1134"/>
-        <w:gridCol w:w="1814"/>
-        <w:gridCol w:w="1814"/>
+        <w:gridCol w:w="1020"/>
+        <w:gridCol w:w="1701"/>
+        <w:gridCol w:w="1701"/>
         <w:gridCol w:w="1814"/>
         <w:gridCol w:w="1701"/>
-        <w:gridCol w:w="1361"/>
+        <w:gridCol w:w="1701"/>
       </w:tblGrid>
       <w:tr>
         <w:tc>
           <w:tcPr>
-            <w:tcW w:type="dxa" w:w="1134"/>
+            <w:tcW w:type="dxa" w:w="1020"/>
             <w:shd w:val="clear" w:color="auto" w:fill="2E4A3E"/>
           </w:tcPr>
           <w:p>
@@ -447,7 +410,7 @@
         </w:tc>
         <w:tc>
           <w:tcPr>
-            <w:tcW w:type="dxa" w:w="1814"/>
+            <w:tcW w:type="dxa" w:w="1701"/>
             <w:shd w:val="clear" w:color="auto" w:fill="2E4A3E"/>
           </w:tcPr>
           <w:p>
@@ -468,7 +431,7 @@
         </w:tc>
         <w:tc>
           <w:tcPr>
-            <w:tcW w:type="dxa" w:w="1814"/>
+            <w:tcW w:type="dxa" w:w="1701"/>
             <w:shd w:val="clear" w:color="auto" w:fill="2E4A3E"/>
           </w:tcPr>
           <w:p>
@@ -504,7 +467,7 @@
                 <w:color w:val="FFFFFF"/>
                 <w:sz w:val="19"/>
               </w:rPr>
-              <w:t>Gewinn zu versteuern / Jahr</w:t>
+              <w:t>Steuerlicher Verlust / Jahr</w:t>
             </w:r>
           </w:p>
         </w:tc>
@@ -531,7 +494,7 @@
         </w:tc>
         <w:tc>
           <w:tcPr>
-            <w:tcW w:type="dxa" w:w="1361"/>
+            <w:tcW w:type="dxa" w:w="1701"/>
             <w:shd w:val="clear" w:color="auto" w:fill="2E4A3E"/>
           </w:tcPr>
           <w:p>
@@ -546,7 +509,7 @@
                 <w:color w:val="FFFFFF"/>
                 <w:sz w:val="19"/>
               </w:rPr>
-              <w:t>Tilgung pro Person / Jahr</w:t>
+              <w:t>Mit Förder-option / Monat</w:t>
             </w:r>
           </w:p>
         </w:tc>
@@ -554,7 +517,7 @@
       <w:tr>
         <w:tc>
           <w:tcPr>
-            <w:tcW w:type="dxa" w:w="1134"/>
+            <w:tcW w:type="dxa" w:w="1020"/>
           </w:tcPr>
           <w:p>
             <w:pPr>
@@ -566,6 +529,42 @@
                 <w:sz w:val="19"/>
               </w:rPr>
               <w:t>1</w:t>
+            </w:r>
+          </w:p>
+        </w:tc>
+        <w:tc>
+          <w:tcPr>
+            <w:tcW w:type="dxa" w:w="1701"/>
+          </w:tcPr>
+          <w:p>
+            <w:pPr>
+              <w:spacing w:after="20"/>
+              <w:jc w:val="right"/>
+            </w:pPr>
+            <w:r/>
+            <w:r>
+              <w:rPr>
+                <w:sz w:val="19"/>
+              </w:rPr>
+              <w:t>−553 €</w:t>
+            </w:r>
+          </w:p>
+        </w:tc>
+        <w:tc>
+          <w:tcPr>
+            <w:tcW w:type="dxa" w:w="1701"/>
+          </w:tcPr>
+          <w:p>
+            <w:pPr>
+              <w:spacing w:after="20"/>
+              <w:jc w:val="right"/>
+            </w:pPr>
+            <w:r/>
+            <w:r>
+              <w:rPr>
+                <w:sz w:val="19"/>
+              </w:rPr>
+              <w:t>−6.641 €</w:t>
             </w:r>
           </w:p>
         </w:tc>
@@ -583,7 +582,98 @@
               <w:rPr>
                 <w:sz w:val="19"/>
               </w:rPr>
-              <w:t>9.613 €</w:t>
+              <w:t>−88.351 €</w:t>
+            </w:r>
+          </w:p>
+        </w:tc>
+        <w:tc>
+          <w:tcPr>
+            <w:tcW w:type="dxa" w:w="1701"/>
+          </w:tcPr>
+          <w:p>
+            <w:pPr>
+              <w:spacing w:after="20"/>
+              <w:jc w:val="right"/>
+            </w:pPr>
+            <w:r/>
+            <w:r>
+              <w:rPr>
+                <w:sz w:val="19"/>
+              </w:rPr>
+              <w:t>+2.024 €</w:t>
+            </w:r>
+          </w:p>
+        </w:tc>
+        <w:tc>
+          <w:tcPr>
+            <w:tcW w:type="dxa" w:w="1701"/>
+          </w:tcPr>
+          <w:p>
+            <w:pPr>
+              <w:spacing w:after="20"/>
+              <w:jc w:val="right"/>
+            </w:pPr>
+            <w:r/>
+            <w:r>
+              <w:rPr>
+                <w:sz w:val="19"/>
+              </w:rPr>
+              <w:t>+6.427 €</w:t>
+            </w:r>
+          </w:p>
+        </w:tc>
+      </w:tr>
+      <w:tr>
+        <w:tc>
+          <w:tcPr>
+            <w:tcW w:type="dxa" w:w="1020"/>
+          </w:tcPr>
+          <w:p>
+            <w:pPr>
+              <w:spacing w:after="20"/>
+            </w:pPr>
+            <w:r/>
+            <w:r>
+              <w:rPr>
+                <w:sz w:val="19"/>
+              </w:rPr>
+              <w:t>2</w:t>
+            </w:r>
+          </w:p>
+        </w:tc>
+        <w:tc>
+          <w:tcPr>
+            <w:tcW w:type="dxa" w:w="1701"/>
+          </w:tcPr>
+          <w:p>
+            <w:pPr>
+              <w:spacing w:after="20"/>
+              <w:jc w:val="right"/>
+            </w:pPr>
+            <w:r/>
+            <w:r>
+              <w:rPr>
+                <w:sz w:val="19"/>
+              </w:rPr>
+              <w:t>−277 €</w:t>
+            </w:r>
+          </w:p>
+        </w:tc>
+        <w:tc>
+          <w:tcPr>
+            <w:tcW w:type="dxa" w:w="1701"/>
+          </w:tcPr>
+          <w:p>
+            <w:pPr>
+              <w:spacing w:after="20"/>
+              <w:jc w:val="right"/>
+            </w:pPr>
+            <w:r/>
+            <w:r>
+              <w:rPr>
+                <w:sz w:val="19"/>
+              </w:rPr>
+              <w:t>−3.320 €</w:t>
             </w:r>
           </w:p>
         </w:tc>
@@ -601,7 +691,98 @@
               <w:rPr>
                 <w:sz w:val="19"/>
               </w:rPr>
-              <w:t>115.359 €</w:t>
+              <w:t>−44.176 €</w:t>
+            </w:r>
+          </w:p>
+        </w:tc>
+        <w:tc>
+          <w:tcPr>
+            <w:tcW w:type="dxa" w:w="1701"/>
+          </w:tcPr>
+          <w:p>
+            <w:pPr>
+              <w:spacing w:after="20"/>
+              <w:jc w:val="right"/>
+            </w:pPr>
+            <w:r/>
+            <w:r>
+              <w:rPr>
+                <w:sz w:val="19"/>
+              </w:rPr>
+              <w:t>+1.012 €</w:t>
+            </w:r>
+          </w:p>
+        </w:tc>
+        <w:tc>
+          <w:tcPr>
+            <w:tcW w:type="dxa" w:w="1701"/>
+          </w:tcPr>
+          <w:p>
+            <w:pPr>
+              <w:spacing w:after="20"/>
+              <w:jc w:val="right"/>
+            </w:pPr>
+            <w:r/>
+            <w:r>
+              <w:rPr>
+                <w:sz w:val="19"/>
+              </w:rPr>
+              <w:t>+3.214 €</w:t>
+            </w:r>
+          </w:p>
+        </w:tc>
+      </w:tr>
+      <w:tr>
+        <w:tc>
+          <w:tcPr>
+            <w:tcW w:type="dxa" w:w="1020"/>
+          </w:tcPr>
+          <w:p>
+            <w:pPr>
+              <w:spacing w:after="20"/>
+            </w:pPr>
+            <w:r/>
+            <w:r>
+              <w:rPr>
+                <w:sz w:val="19"/>
+              </w:rPr>
+              <w:t>4</w:t>
+            </w:r>
+          </w:p>
+        </w:tc>
+        <w:tc>
+          <w:tcPr>
+            <w:tcW w:type="dxa" w:w="1701"/>
+          </w:tcPr>
+          <w:p>
+            <w:pPr>
+              <w:spacing w:after="20"/>
+              <w:jc w:val="right"/>
+            </w:pPr>
+            <w:r/>
+            <w:r>
+              <w:rPr>
+                <w:sz w:val="19"/>
+              </w:rPr>
+              <w:t>−138 €</w:t>
+            </w:r>
+          </w:p>
+        </w:tc>
+        <w:tc>
+          <w:tcPr>
+            <w:tcW w:type="dxa" w:w="1701"/>
+          </w:tcPr>
+          <w:p>
+            <w:pPr>
+              <w:spacing w:after="20"/>
+              <w:jc w:val="right"/>
+            </w:pPr>
+            <w:r/>
+            <w:r>
+              <w:rPr>
+                <w:sz w:val="19"/>
+              </w:rPr>
+              <w:t>−1.660 €</w:t>
             </w:r>
           </w:p>
         </w:tc>
@@ -619,7 +800,7 @@
               <w:rPr>
                 <w:sz w:val="19"/>
               </w:rPr>
-              <w:t>34.987 €</w:t>
+              <w:t>−22.088 €</w:t>
             </w:r>
           </w:p>
         </w:tc>
@@ -637,13 +818,13 @@
               <w:rPr>
                 <w:sz w:val="19"/>
               </w:rPr>
-              <w:t>8.593 €</w:t>
+              <w:t>+506 €</w:t>
             </w:r>
           </w:p>
         </w:tc>
         <w:tc>
           <w:tcPr>
-            <w:tcW w:type="dxa" w:w="1361"/>
+            <w:tcW w:type="dxa" w:w="1701"/>
           </w:tcPr>
           <w:p>
             <w:pPr>
@@ -655,7 +836,7 @@
               <w:rPr>
                 <w:sz w:val="19"/>
               </w:rPr>
-              <w:t>49.216 €</w:t>
+              <w:t>+1.607 €</w:t>
             </w:r>
           </w:p>
         </w:tc>
@@ -663,7 +844,7 @@
       <w:tr>
         <w:tc>
           <w:tcPr>
-            <w:tcW w:type="dxa" w:w="1134"/>
+            <w:tcW w:type="dxa" w:w="1020"/>
           </w:tcPr>
           <w:p>
             <w:pPr>
@@ -674,7 +855,43 @@
               <w:rPr>
                 <w:sz w:val="19"/>
               </w:rPr>
-              <w:t>2</w:t>
+              <w:t>8</w:t>
+            </w:r>
+          </w:p>
+        </w:tc>
+        <w:tc>
+          <w:tcPr>
+            <w:tcW w:type="dxa" w:w="1701"/>
+          </w:tcPr>
+          <w:p>
+            <w:pPr>
+              <w:spacing w:after="20"/>
+              <w:jc w:val="right"/>
+            </w:pPr>
+            <w:r/>
+            <w:r>
+              <w:rPr>
+                <w:sz w:val="19"/>
+              </w:rPr>
+              <w:t>−69 €</w:t>
+            </w:r>
+          </w:p>
+        </w:tc>
+        <w:tc>
+          <w:tcPr>
+            <w:tcW w:type="dxa" w:w="1701"/>
+          </w:tcPr>
+          <w:p>
+            <w:pPr>
+              <w:spacing w:after="20"/>
+              <w:jc w:val="right"/>
+            </w:pPr>
+            <w:r/>
+            <w:r>
+              <w:rPr>
+                <w:sz w:val="19"/>
+              </w:rPr>
+              <w:t>−830 €</w:t>
             </w:r>
           </w:p>
         </w:tc>
@@ -692,43 +909,7 @@
               <w:rPr>
                 <w:sz w:val="19"/>
               </w:rPr>
-              <w:t>4.807 €</w:t>
-            </w:r>
-          </w:p>
-        </w:tc>
-        <w:tc>
-          <w:tcPr>
-            <w:tcW w:type="dxa" w:w="1814"/>
-          </w:tcPr>
-          <w:p>
-            <w:pPr>
-              <w:spacing w:after="20"/>
-              <w:jc w:val="right"/>
-            </w:pPr>
-            <w:r/>
-            <w:r>
-              <w:rPr>
-                <w:sz w:val="19"/>
-              </w:rPr>
-              <w:t>57.679 €</w:t>
-            </w:r>
-          </w:p>
-        </w:tc>
-        <w:tc>
-          <w:tcPr>
-            <w:tcW w:type="dxa" w:w="1814"/>
-          </w:tcPr>
-          <w:p>
-            <w:pPr>
-              <w:spacing w:after="20"/>
-              <w:jc w:val="right"/>
-            </w:pPr>
-            <w:r/>
-            <w:r>
-              <w:rPr>
-                <w:sz w:val="19"/>
-              </w:rPr>
-              <w:t>17.494 €</w:t>
+              <w:t>−11.044 €</w:t>
             </w:r>
           </w:p>
         </w:tc>
@@ -746,98 +927,7 @@
               <w:rPr>
                 <w:sz w:val="19"/>
               </w:rPr>
-              <w:t>4.296 €</w:t>
-            </w:r>
-          </w:p>
-        </w:tc>
-        <w:tc>
-          <w:tcPr>
-            <w:tcW w:type="dxa" w:w="1361"/>
-          </w:tcPr>
-          <w:p>
-            <w:pPr>
-              <w:spacing w:after="20"/>
-              <w:jc w:val="right"/>
-            </w:pPr>
-            <w:r/>
-            <w:r>
-              <w:rPr>
-                <w:sz w:val="19"/>
-              </w:rPr>
-              <w:t>24.608 €</w:t>
-            </w:r>
-          </w:p>
-        </w:tc>
-      </w:tr>
-      <w:tr>
-        <w:tc>
-          <w:tcPr>
-            <w:tcW w:type="dxa" w:w="1134"/>
-          </w:tcPr>
-          <w:p>
-            <w:pPr>
-              <w:spacing w:after="20"/>
-            </w:pPr>
-            <w:r/>
-            <w:r>
-              <w:rPr>
-                <w:sz w:val="19"/>
-              </w:rPr>
-              <w:t>4</w:t>
-            </w:r>
-          </w:p>
-        </w:tc>
-        <w:tc>
-          <w:tcPr>
-            <w:tcW w:type="dxa" w:w="1814"/>
-          </w:tcPr>
-          <w:p>
-            <w:pPr>
-              <w:spacing w:after="20"/>
-              <w:jc w:val="right"/>
-            </w:pPr>
-            <w:r/>
-            <w:r>
-              <w:rPr>
-                <w:sz w:val="19"/>
-              </w:rPr>
-              <w:t>2.403 €</w:t>
-            </w:r>
-          </w:p>
-        </w:tc>
-        <w:tc>
-          <w:tcPr>
-            <w:tcW w:type="dxa" w:w="1814"/>
-          </w:tcPr>
-          <w:p>
-            <w:pPr>
-              <w:spacing w:after="20"/>
-              <w:jc w:val="right"/>
-            </w:pPr>
-            <w:r/>
-            <w:r>
-              <w:rPr>
-                <w:sz w:val="19"/>
-              </w:rPr>
-              <w:t>28.840 €</w:t>
-            </w:r>
-          </w:p>
-        </w:tc>
-        <w:tc>
-          <w:tcPr>
-            <w:tcW w:type="dxa" w:w="1814"/>
-          </w:tcPr>
-          <w:p>
-            <w:pPr>
-              <w:spacing w:after="20"/>
-              <w:jc w:val="right"/>
-            </w:pPr>
-            <w:r/>
-            <w:r>
-              <w:rPr>
-                <w:sz w:val="19"/>
-              </w:rPr>
-              <w:t>8.747 €</w:t>
+              <w:t>+253 €</w:t>
             </w:r>
           </w:p>
         </w:tc>
@@ -855,134 +945,7 @@
               <w:rPr>
                 <w:sz w:val="19"/>
               </w:rPr>
-              <w:t>2.148 €</w:t>
-            </w:r>
-          </w:p>
-        </w:tc>
-        <w:tc>
-          <w:tcPr>
-            <w:tcW w:type="dxa" w:w="1361"/>
-          </w:tcPr>
-          <w:p>
-            <w:pPr>
-              <w:spacing w:after="20"/>
-              <w:jc w:val="right"/>
-            </w:pPr>
-            <w:r/>
-            <w:r>
-              <w:rPr>
-                <w:sz w:val="19"/>
-              </w:rPr>
-              <w:t>12.304 €</w:t>
-            </w:r>
-          </w:p>
-        </w:tc>
-      </w:tr>
-      <w:tr>
-        <w:tc>
-          <w:tcPr>
-            <w:tcW w:type="dxa" w:w="1134"/>
-          </w:tcPr>
-          <w:p>
-            <w:pPr>
-              <w:spacing w:after="20"/>
-            </w:pPr>
-            <w:r/>
-            <w:r>
-              <w:rPr>
-                <w:sz w:val="19"/>
-              </w:rPr>
-              <w:t>8</w:t>
-            </w:r>
-          </w:p>
-        </w:tc>
-        <w:tc>
-          <w:tcPr>
-            <w:tcW w:type="dxa" w:w="1814"/>
-          </w:tcPr>
-          <w:p>
-            <w:pPr>
-              <w:spacing w:after="20"/>
-              <w:jc w:val="right"/>
-            </w:pPr>
-            <w:r/>
-            <w:r>
-              <w:rPr>
-                <w:sz w:val="19"/>
-              </w:rPr>
-              <w:t>1.202 €</w:t>
-            </w:r>
-          </w:p>
-        </w:tc>
-        <w:tc>
-          <w:tcPr>
-            <w:tcW w:type="dxa" w:w="1814"/>
-          </w:tcPr>
-          <w:p>
-            <w:pPr>
-              <w:spacing w:after="20"/>
-              <w:jc w:val="right"/>
-            </w:pPr>
-            <w:r/>
-            <w:r>
-              <w:rPr>
-                <w:sz w:val="19"/>
-              </w:rPr>
-              <w:t>14.420 €</w:t>
-            </w:r>
-          </w:p>
-        </w:tc>
-        <w:tc>
-          <w:tcPr>
-            <w:tcW w:type="dxa" w:w="1814"/>
-          </w:tcPr>
-          <w:p>
-            <w:pPr>
-              <w:spacing w:after="20"/>
-              <w:jc w:val="right"/>
-            </w:pPr>
-            <w:r/>
-            <w:r>
-              <w:rPr>
-                <w:sz w:val="19"/>
-              </w:rPr>
-              <w:t>4.373 €</w:t>
-            </w:r>
-          </w:p>
-        </w:tc>
-        <w:tc>
-          <w:tcPr>
-            <w:tcW w:type="dxa" w:w="1701"/>
-          </w:tcPr>
-          <w:p>
-            <w:pPr>
-              <w:spacing w:after="20"/>
-              <w:jc w:val="right"/>
-            </w:pPr>
-            <w:r/>
-            <w:r>
-              <w:rPr>
-                <w:sz w:val="19"/>
-              </w:rPr>
-              <w:t>1.074 €</w:t>
-            </w:r>
-          </w:p>
-        </w:tc>
-        <w:tc>
-          <w:tcPr>
-            <w:tcW w:type="dxa" w:w="1361"/>
-          </w:tcPr>
-          <w:p>
-            <w:pPr>
-              <w:spacing w:after="20"/>
-              <w:jc w:val="right"/>
-            </w:pPr>
-            <w:r/>
-            <w:r>
-              <w:rPr>
-                <w:sz w:val="19"/>
-              </w:rPr>
-              <w:t>6.152 €</w:t>
+              <w:t>+803 €</w:t>
             </w:r>
           </w:p>
         </w:tc>
@@ -1002,7 +965,19 @@
           <w:b w:val="0"/>
           <w:i w:val="0"/>
         </w:rPr>
-        <w:t>Steuerlich ist der Gewinn nur 34.987 € im Jahr: Zinsen (163.585 €) und Gebäudeabschreibung 3 % (129.587 €) mindern ihn, die Tilgung (49.216 €) nicht. Die Tilgung ist aber Vermögensaufbau, denn sie senkt die Schulden. Der Steuersatz von 35 % ist eine Annahme und hängt vom persönlichen Einkommen ab.</w:t>
+        <w:t>Ohne Eigenkapital liegt der Cash knapp unter null. Nach Steuer (35 % Grenzsteuersatz, Annahme) bleibt es positiv, weil Zinsen (156.592 €) und Gebäudeabschreibung 3 % (131.387 €) einen steuerlichen Verlust von 88.351 € erzeugen, den die Gesellschafter mit anderen Einkünften verrechnen. Die Tilgung (49.677 € im Jahr, 6.210 € pro Person bei 8) baut Vermögen auf. Die Förderoption (degressive AfA und Sonder-AfA im Wohnteil) erhöht die Abschreibung auf 282.367 €, Fristen müssen geprüft werden.</w:t>
+      </w:r>
+    </w:p>
+    <w:p>
+      <w:pPr>
+        <w:spacing w:after="80" w:before="0"/>
+      </w:pPr>
+      <w:r>
+        <w:rPr>
+          <w:b w:val="0"/>
+          <w:i w:val="0"/>
+        </w:rPr>
+        <w:t>Mit Eigenkapital: Bringen die Gesellschafter 749.000 € ein (93.625 € pro Kopf bei 8 Personen), erreicht die GbR Deckung 1,2 und +2.776 € Cash im Monat (+347 € pro Kopf bei 8 Personen vor Steuern). Mit 8 statt 12 Wohnungen wären es 871.000 € Eigenkapital.</w:t>
       </w:r>
     </w:p>
     <w:p>
@@ -1024,49 +999,49 @@
     <w:p>
       <w:pPr>
         <w:pStyle w:val="ListBullet"/>
-        <w:spacing w:after="40"/>
+        <w:spacing w:after="20"/>
       </w:pPr>
       <w:r>
         <w:rPr>
-          <w:sz w:val="20"/>
+          <w:sz w:val="19"/>
         </w:rPr>
-        <w:t>Ohne Gastro-Gewinn fehlen 61.378 € im Jahr (Kapitaldienstdeckung nur 0,71), der Gewinn hängt also an einer gut laufenden Gastro.</w:t>
+        <w:t>Die Pacht hängt am Gastro-Umsatz (Plan 95.635 € im Monat). Fällt die Gastro aus, fehlen der GbR zusätzlich 103.286 € im Jahr (Deckung 0,47).</w:t>
       </w:r>
     </w:p>
     <w:p>
       <w:pPr>
         <w:pStyle w:val="ListBullet"/>
-        <w:spacing w:after="40"/>
+        <w:spacing w:after="20"/>
       </w:pPr>
       <w:r>
         <w:rPr>
-          <w:sz w:val="20"/>
+          <w:sz w:val="19"/>
         </w:rPr>
-        <w:t>Der Beleihungsauslauf liegt bei 187 %: Die Bank verlangt zusätzliche Sicherheiten (Grundschulden, Bürgschaften oder Eigenkapital), die Lücke zur 80-%-Grenze beträgt etwa 2,77 Mio € insgesamt.</w:t>
+        <w:t>Der Beleihungsauslauf liegt bei 151 %: Die Bank verlangt zusätzliche Sicherheiten oder Eigenkapital, die Lücke zur 80-%-Grenze beträgt etwa 2,31 Mio € insgesamt.</w:t>
       </w:r>
     </w:p>
     <w:p>
       <w:pPr>
         <w:pStyle w:val="ListBullet"/>
-        <w:spacing w:after="40"/>
+        <w:spacing w:after="20"/>
       </w:pPr>
       <w:r>
         <w:rPr>
-          <w:sz w:val="20"/>
+          <w:sz w:val="19"/>
         </w:rPr>
-        <w:t>Eine GbR haftet mit dem persönlichen Vermögen aller Gesellschafter. Betreibt die GbR auch die Gastro, ist sie komplett gewerblich (Gewerbesteuer), besser ist eine getrennte Betreiberfirma, die Pacht zahlt.</w:t>
+        <w:t>Eine GbR haftet mit dem persönlichen Vermögen aller Gesellschafter. Die Gastro läuft deshalb in einer getrennten Betreiberfirma, die Pacht zahlt.</w:t>
       </w:r>
     </w:p>
     <w:p>
       <w:pPr>
         <w:pStyle w:val="ListBullet"/>
-        <w:spacing w:after="40"/>
+        <w:spacing w:after="20"/>
       </w:pPr>
       <w:r>
         <w:rPr>
-          <w:sz w:val="20"/>
+          <w:sz w:val="19"/>
         </w:rPr>
-        <w:t>Der Lohn des Bauherrn, mögliche Sonderabschreibungen und Gewerbesteuer sind nicht gerechnet. Steuerberater und Bank müssen das prüfen.</w:t>
+        <w:t>Lohn des Bauherrn, Mehrkosten kleinerer Wohnungen über die angesetzten 15.000 € hinaus und Gewerbesteuer sind nicht gerechnet. Steuerberater und Bank müssen das prüfen.</w:t>
       </w:r>
     </w:p>
     <w:p>
@@ -1080,12 +1055,12 @@
           <w:color w:val="5A5F66"/>
           <w:sz w:val="17"/>
         </w:rPr>
-        <w:t>Quelle: Bankunterlagen_Baufeld3.xlsx (Blätter Ertrag und Cashflow, Tilgungsplan, Gastro Tagesteile).</w:t>
+        <w:t>Quelle: Bankunterlagen_Baufeld3.xlsx (Blätter Ertrag und Cashflow, Gesellschafter, Szenarien).</w:t>
       </w:r>
     </w:p>
     <w:sectPr>
       <w:pgSz w:w="11906" w:h="16838"/>
-      <w:pgMar w:top="1020" w:right="1134" w:bottom="907" w:left="1134" w:header="720" w:footer="720" w:gutter="0"/>
+      <w:pgMar w:top="794" w:right="1134" w:bottom="680" w:left="1134" w:header="720" w:footer="720" w:gutter="0"/>
       <w:cols w:space="720"/>
       <w:docGrid w:linePitch="360"/>
     </w:sectPr>
@@ -1458,7 +1433,7 @@
     <w:rsid w:val="00FC693F"/>
     <w:rPr>
       <w:rFonts w:ascii="Calibri" w:hAnsi="Calibri" w:eastAsia="Calibri"/>
-      <w:sz w:val="21"/>
+      <w:sz w:val="19"/>
     </w:rPr>
   </w:style>
   <w:style w:type="paragraph" w:styleId="Header">

</xml_diff>